<commit_message>
Auto-save: 76 file(s) — 2026-08-25 15:08
</commit_message>
<xml_diff>
--- a/Projects/NEPRA Follow-Up Letters/14_DIN_Group.docx
+++ b/Projects/NEPRA Follow-Up Letters/14_DIN_Group.docx
@@ -105,18 +105,7 @@
           <w:sz w:val="19"/>
           <w:szCs w:val="19"/>
         </w:rPr>
-        <w:t xml:space="preserve">Subject: Follow-Up: NEPRA IT/OT Security Compliance Support for </w:t>
-      </w:r>
-      <w:r>
-        <w:rPr>
-          <w:rFonts w:ascii="Poppins" w:eastAsia="Calibri" w:hAnsi="Poppins" w:cs="Poppins"/>
-          <w:b/>
-          <w:bCs/>
-          <w:color w:val="0B2545"/>
-          <w:sz w:val="19"/>
-          <w:szCs w:val="19"/>
-        </w:rPr>
-        <w:t>DIN Group</w:t>
+        <w:t>Subject: Follow up: NEPRA (Security of Information Technology and Operational Technology) Regulations, 2022 — Compliance Advisory &amp; Support Services</w:t>
       </w:r>
     </w:p>
     <w:p>
@@ -174,7 +163,23 @@
           <w:sz w:val="19"/>
           <w:szCs w:val="19"/>
         </w:rPr>
-        <w:t xml:space="preserve">I’m following up on our earlier note regarding NEPRA’s Security of IT and OT Regulations, 2022. As specialists in NEPRA compliance, we’d welcome the opportunity to support </w:t>
+        <w:t xml:space="preserve">I’m following up on </w:t>
+      </w:r>
+      <w:r>
+        <w:rPr>
+          <w:rFonts w:ascii="Poppins" w:hAnsi="Poppins" w:cs="Poppins"/>
+          <w:sz w:val="19"/>
+          <w:szCs w:val="19"/>
+        </w:rPr>
+        <w:t>our earlier letter regarding</w:t>
+      </w:r>
+      <w:r>
+        <w:rPr>
+          <w:rFonts w:ascii="Poppins" w:hAnsi="Poppins" w:cs="Poppins"/>
+          <w:sz w:val="19"/>
+          <w:szCs w:val="19"/>
+        </w:rPr>
+        <w:t xml:space="preserve"> NEPRA’s Security of IT and OT Regulations, 2022. As specialists in NEPRA compliance, we’d welcome the opportunity to support </w:t>
       </w:r>
       <w:r>
         <w:rPr>
@@ -376,7 +381,25 @@
           <w:sz w:val="19"/>
           <w:szCs w:val="19"/>
         </w:rPr>
-        <w:t>We’d welcome a brief call to walk your team through a tailored compliance roadmap, starting with a complimentary gap assessment. Reach out at your convenience, or learn more at www.xloopdigital.com/services/cyber-security-service.</w:t>
+        <w:t xml:space="preserve">We’d welcome a brief call to walk your team through a tailored compliance roadmap, starting with a complimentary gap assessment. Reach out at your convenience, or learn more </w:t>
+      </w:r>
+      <w:r>
+        <w:rPr>
+          <w:rFonts w:ascii="Poppins" w:eastAsia="Calibri" w:hAnsi="Poppins" w:cs="Poppins"/>
+          <w:color w:val="3A3A3A"/>
+          <w:sz w:val="19"/>
+          <w:szCs w:val="19"/>
+        </w:rPr>
+        <w:t>at https://www.xloopdigital.com/services/cyber-security-service</w:t>
+      </w:r>
+      <w:r>
+        <w:rPr>
+          <w:rFonts w:ascii="Poppins" w:eastAsia="Calibri" w:hAnsi="Poppins" w:cs="Poppins"/>
+          <w:color w:val="3A3A3A"/>
+          <w:sz w:val="19"/>
+          <w:szCs w:val="19"/>
+        </w:rPr>
+        <w:t>.</w:t>
       </w:r>
     </w:p>
     <w:p>

</xml_diff>